<commit_message>
added final documents for increment 2
</commit_message>
<xml_diff>
--- a/RD.docx
+++ b/RD.docx
@@ -161,7 +161,7 @@
           <w:szCs w:val="28"/>
           <w:rtl w:val="0"/>
         </w:rPr>
-        <w:t xml:space="preserve">Version 1.0</w:t>
+        <w:t xml:space="preserve">Version 2.0</w:t>
       </w:r>
     </w:p>
     <w:p>
@@ -452,7 +452,35 @@
           <w:szCs w:val="20"/>
           <w:rtl w:val="0"/>
         </w:rPr>
-        <w:t xml:space="preserve">For this project, we’re calling Tomodachi Life: Remade. This game will try and remake many of the features and aspects from the original Nintendo game, such as creating and living with Mii characters, playing with them and seeing how their life unfolds. As the player, you can dress up each character and decorate their rooms, as well as feed them and take care of them. It’s a life-simulator game. For the scope of this project, however, we will be mainly focused on creating characters, games to play with them, and potentially implementing an event system</w:t>
+        <w:t xml:space="preserve">Our project is</w:t>
+      </w:r>
+      <w:r>
+        <w:rPr>
+          <w:rFonts w:ascii="Arial" w:cs="Arial" w:eastAsia="Arial" w:hAnsi="Arial"/>
+          <w:sz w:val="20"/>
+          <w:szCs w:val="20"/>
+          <w:rtl w:val="0"/>
+        </w:rPr>
+        <w:t xml:space="preserve"> called </w:t>
+      </w:r>
+      <w:r>
+        <w:rPr>
+          <w:rFonts w:ascii="Arial" w:cs="Arial" w:eastAsia="Arial" w:hAnsi="Arial"/>
+          <w:i w:val="1"/>
+          <w:sz w:val="20"/>
+          <w:szCs w:val="20"/>
+          <w:rtl w:val="0"/>
+        </w:rPr>
+        <w:t xml:space="preserve">Tomodachi Life: Remade</w:t>
+      </w:r>
+      <w:r>
+        <w:rPr>
+          <w:rFonts w:ascii="Arial" w:cs="Arial" w:eastAsia="Arial" w:hAnsi="Arial"/>
+          <w:sz w:val="20"/>
+          <w:szCs w:val="20"/>
+          <w:rtl w:val="0"/>
+        </w:rPr>
+        <w:t xml:space="preserve">. This game will try and remake many of the features and aspects from the original Nintendo game, such as creating and living with Mii characters, and playing minigames with them. As the player, you can edit the appearance of the characters, as well as feed them and take care of them. It’s a life-simulator game. For the scope of this project, however, we will be mainly focused on creating characters, games to play with them, and potentially implementing an event system</w:t>
       </w:r>
       <w:r>
         <w:rPr>
@@ -1014,6 +1042,56 @@
     </w:p>
     <w:p>
       <w:pPr>
+        <w:numPr>
+          <w:ilvl w:val="0"/>
+          <w:numId w:val="3"/>
+        </w:numPr>
+        <w:shd w:fill="ffffff" w:val="clear"/>
+        <w:ind w:left="720" w:hanging="360"/>
+        <w:rPr>
+          <w:rFonts w:ascii="Arial" w:cs="Arial" w:eastAsia="Arial" w:hAnsi="Arial"/>
+          <w:sz w:val="20"/>
+          <w:szCs w:val="20"/>
+          <w:u w:val="none"/>
+        </w:rPr>
+      </w:pPr>
+      <w:r>
+        <w:rPr>
+          <w:rFonts w:ascii="Arial" w:cs="Arial" w:eastAsia="Arial" w:hAnsi="Arial"/>
+          <w:sz w:val="20"/>
+          <w:szCs w:val="20"/>
+          <w:rtl w:val="0"/>
+        </w:rPr>
+        <w:t xml:space="preserve">Cleanliness of interface</w:t>
+      </w:r>
+    </w:p>
+    <w:p>
+      <w:pPr>
+        <w:numPr>
+          <w:ilvl w:val="0"/>
+          <w:numId w:val="3"/>
+        </w:numPr>
+        <w:shd w:fill="ffffff" w:val="clear"/>
+        <w:ind w:left="720" w:hanging="360"/>
+        <w:rPr>
+          <w:rFonts w:ascii="Arial" w:cs="Arial" w:eastAsia="Arial" w:hAnsi="Arial"/>
+          <w:sz w:val="20"/>
+          <w:szCs w:val="20"/>
+          <w:u w:val="none"/>
+        </w:rPr>
+      </w:pPr>
+      <w:r>
+        <w:rPr>
+          <w:rFonts w:ascii="Arial" w:cs="Arial" w:eastAsia="Arial" w:hAnsi="Arial"/>
+          <w:sz w:val="20"/>
+          <w:szCs w:val="20"/>
+          <w:rtl w:val="0"/>
+        </w:rPr>
+        <w:t xml:space="preserve">Variety in gameplay</w:t>
+      </w:r>
+    </w:p>
+    <w:p>
+      <w:pPr>
         <w:shd w:fill="ffffff" w:val="clear"/>
         <w:rPr>
           <w:rFonts w:ascii="Arial" w:cs="Arial" w:eastAsia="Arial" w:hAnsi="Arial"/>
@@ -1074,14 +1152,14 @@
         </w:rPr>
         <w:drawing>
           <wp:inline distB="114300" distT="114300" distL="114300" distR="114300">
-            <wp:extent cx="5486400" cy="4864100"/>
+            <wp:extent cx="5486400" cy="4356100"/>
             <wp:effectExtent b="0" l="0" r="0" t="0"/>
-            <wp:docPr id="2" name="image3.png"/>
+            <wp:docPr id="1" name="image2.png"/>
             <a:graphic>
               <a:graphicData uri="http://schemas.openxmlformats.org/drawingml/2006/picture">
                 <pic:pic>
                   <pic:nvPicPr>
-                    <pic:cNvPr id="0" name="image3.png"/>
+                    <pic:cNvPr id="0" name="image2.png"/>
                     <pic:cNvPicPr preferRelativeResize="0"/>
                   </pic:nvPicPr>
                   <pic:blipFill>
@@ -1094,7 +1172,7 @@
                   <pic:spPr>
                     <a:xfrm>
                       <a:off x="0" y="0"/>
-                      <a:ext cx="5486400" cy="4864100"/>
+                      <a:ext cx="5486400" cy="4356100"/>
                     </a:xfrm>
                     <a:prstGeom prst="rect"/>
                     <a:ln/>
@@ -1154,14 +1232,14 @@
         </w:rPr>
         <w:drawing>
           <wp:inline distB="114300" distT="114300" distL="114300" distR="114300">
-            <wp:extent cx="5486400" cy="4991100"/>
+            <wp:extent cx="5486400" cy="3200400"/>
             <wp:effectExtent b="0" l="0" r="0" t="0"/>
-            <wp:docPr id="3" name="image2.png"/>
+            <wp:docPr id="3" name="image3.png"/>
             <a:graphic>
               <a:graphicData uri="http://schemas.openxmlformats.org/drawingml/2006/picture">
                 <pic:pic>
                   <pic:nvPicPr>
-                    <pic:cNvPr id="0" name="image2.png"/>
+                    <pic:cNvPr id="0" name="image3.png"/>
                     <pic:cNvPicPr preferRelativeResize="0"/>
                   </pic:nvPicPr>
                   <pic:blipFill>
@@ -1174,7 +1252,7 @@
                   <pic:spPr>
                     <a:xfrm>
                       <a:off x="0" y="0"/>
-                      <a:ext cx="5486400" cy="4991100"/>
+                      <a:ext cx="5486400" cy="3200400"/>
                     </a:xfrm>
                     <a:prstGeom prst="rect"/>
                     <a:ln/>
@@ -1212,7 +1290,7 @@
           <wp:inline distB="114300" distT="114300" distL="114300" distR="114300">
             <wp:extent cx="5486400" cy="3263900"/>
             <wp:effectExtent b="0" l="0" r="0" t="0"/>
-            <wp:docPr id="1" name="image1.png"/>
+            <wp:docPr id="2" name="image1.png"/>
             <a:graphic>
               <a:graphicData uri="http://schemas.openxmlformats.org/drawingml/2006/picture">
                 <pic:pic>

</xml_diff>